<commit_message>
Annexes complètes : 3 schémas en PNG haute résolution, matrices risques et décision, tableau des 25 sources de veille, glossaire (md + Word avec images intégrées)
Co-Authored-By: Claude Fable 5 <noreply@anthropic.com>
</commit_message>
<xml_diff>
--- a/livrables/03_cahier_des_charges_C4.docx
+++ b/livrables/03_cahier_des_charges_C4.docx
@@ -1969,7 +1969,59 @@
     </w:p>
     <w:p>
       <w:r>
-        <w:t>Le schéma détaillé figure en annexe (schéma 3 du document annexes/schemas_flux.md).</w:t>
+        <w:lastRenderedPageBreak/>
+        <w:drawing>
+          <wp:anchor distT="0" distB="0" distL="114300" distR="114300" simplePos="0" relativeHeight="251659264" behindDoc="0" locked="0" layoutInCell="1" allowOverlap="1" wp14:anchorId="7C321A3E" wp14:editId="6FA906B9">
+            <wp:simplePos x="0" y="0"/>
+            <wp:positionH relativeFrom="column">
+              <wp:posOffset>-447040</wp:posOffset>
+            </wp:positionH>
+            <wp:positionV relativeFrom="paragraph">
+              <wp:posOffset>-130175</wp:posOffset>
+            </wp:positionV>
+            <wp:extent cx="6844030" cy="6707505"/>
+            <wp:effectExtent l="0" t="0" r="0" b="0"/>
+            <wp:wrapSquare wrapText="bothSides"/>
+            <wp:docPr id="806595610" name="Image 1"/>
+            <wp:cNvGraphicFramePr>
+              <a:graphicFrameLocks xmlns:a="http://schemas.openxmlformats.org/drawingml/2006/main" noChangeAspect="1"/>
+            </wp:cNvGraphicFramePr>
+            <a:graphic xmlns:a="http://schemas.openxmlformats.org/drawingml/2006/main">
+              <a:graphicData uri="http://schemas.openxmlformats.org/drawingml/2006/picture">
+                <pic:pic xmlns:pic="http://schemas.openxmlformats.org/drawingml/2006/picture">
+                  <pic:nvPicPr>
+                    <pic:cNvPr id="806595610" name=""/>
+                    <pic:cNvPicPr/>
+                  </pic:nvPicPr>
+                  <pic:blipFill>
+                    <a:blip r:embed="rId6"/>
+                    <a:stretch>
+                      <a:fillRect/>
+                    </a:stretch>
+                  </pic:blipFill>
+                  <pic:spPr>
+                    <a:xfrm>
+                      <a:off x="0" y="0"/>
+                      <a:ext cx="6844030" cy="6707505"/>
+                    </a:xfrm>
+                    <a:prstGeom prst="rect">
+                      <a:avLst/>
+                    </a:prstGeom>
+                  </pic:spPr>
+                </pic:pic>
+              </a:graphicData>
+            </a:graphic>
+            <wp14:sizeRelH relativeFrom="margin">
+              <wp14:pctWidth>0</wp14:pctWidth>
+            </wp14:sizeRelH>
+            <wp14:sizeRelV relativeFrom="margin">
+              <wp14:pctHeight>0</wp14:pctHeight>
+            </wp14:sizeRelV>
+          </wp:anchor>
+        </w:drawing>
+      </w:r>
+      <w:r>
+        <w:t>.</w:t>
       </w:r>
     </w:p>
     <w:p>
@@ -1980,11 +2032,7 @@
         <w:t>Technologies pressenties</w:t>
       </w:r>
       <w:r>
-        <w:t xml:space="preserve"> (issues de la veille, versions vérifiées au 20/07/2026 ; la décision finale est argumentée dans le rapport C5) : Apache Airflow 3.3 (orchestration), dbt-core 1.12 (transformations tracées), GX Core 1.19 (qualité), Apache Superset 6.1 (tableaux </w:t>
-      </w:r>
-      <w:r>
-        <w:lastRenderedPageBreak/>
-        <w:t>de bord), Parquet/Iceberg (stockage). Socle 100 % open source sous licence Apache 2.0, sans coût de licence.</w:t>
+        <w:t xml:space="preserve"> (issues de la veille, versions vérifiées au 20/07/2026 ; la décision finale est argumentée dans le rapport C5) : Apache Airflow 3.3 (orchestration), dbt-core 1.12 (transformations tracées), GX Core 1.19 (qualité), Apache Superset 6.1 (tableaux de bord), Parquet/Iceberg (stockage). Socle 100 % open source sous licence Apache 2.0, sans coût de licence.</w:t>
       </w:r>
     </w:p>
     <w:p>
@@ -1992,6 +2040,7 @@
         <w:pStyle w:val="Titre1"/>
       </w:pPr>
       <w:r>
+        <w:lastRenderedPageBreak/>
         <w:t>3.6 Contraintes et risques</w:t>
       </w:r>
     </w:p>
@@ -2723,8 +2772,66 @@
               <w:rPr>
                 <w:sz w:val="18"/>
               </w:rPr>
+              <w:t>R3</w:t>
+            </w:r>
+          </w:p>
+        </w:tc>
+        <w:tc>
+          <w:tcPr>
+            <w:tcW w:w="1440" w:type="dxa"/>
+          </w:tcPr>
+          <w:p>
+            <w:r>
+              <w:rPr>
+                <w:sz w:val="18"/>
+              </w:rPr>
+              <w:t>Saturation du stockage par les flux temps réel</w:t>
+            </w:r>
+          </w:p>
+        </w:tc>
+        <w:tc>
+          <w:tcPr>
+            <w:tcW w:w="1440" w:type="dxa"/>
+          </w:tcPr>
+          <w:p>
+            <w:r>
+              <w:rPr>
+                <w:sz w:val="18"/>
+              </w:rPr>
+              <w:t>Moyenne</w:t>
+            </w:r>
+          </w:p>
+        </w:tc>
+        <w:tc>
+          <w:tcPr>
+            <w:tcW w:w="1440" w:type="dxa"/>
+          </w:tcPr>
+          <w:p>
+            <w:r>
+              <w:rPr>
+                <w:sz w:val="18"/>
+              </w:rPr>
+              <w:t>Moyen</w:t>
+            </w:r>
+          </w:p>
+        </w:tc>
+        <w:tc>
+          <w:tcPr>
+            <w:tcW w:w="1440" w:type="dxa"/>
+          </w:tcPr>
+          <w:p>
+            <w:r>
+              <w:rPr>
+                <w:sz w:val="18"/>
+              </w:rPr>
+              <w:t xml:space="preserve">Rétention 30 jours du brut, agrégation progressive, purge </w:t>
+            </w:r>
+            <w:r>
+              <w:rPr>
+                <w:sz w:val="18"/>
+              </w:rPr>
               <w:lastRenderedPageBreak/>
-              <w:t>R3</w:t>
+              <w:t>automatisée</w:t>
             </w:r>
           </w:p>
         </w:tc>
@@ -2737,58 +2844,7 @@
               <w:rPr>
                 <w:sz w:val="18"/>
               </w:rPr>
-              <w:t>Saturation du stockage par les flux temps réel</w:t>
-            </w:r>
-          </w:p>
-        </w:tc>
-        <w:tc>
-          <w:tcPr>
-            <w:tcW w:w="1440" w:type="dxa"/>
-          </w:tcPr>
-          <w:p>
-            <w:r>
-              <w:rPr>
-                <w:sz w:val="18"/>
-              </w:rPr>
-              <w:t>Moyenne</w:t>
-            </w:r>
-          </w:p>
-        </w:tc>
-        <w:tc>
-          <w:tcPr>
-            <w:tcW w:w="1440" w:type="dxa"/>
-          </w:tcPr>
-          <w:p>
-            <w:r>
-              <w:rPr>
-                <w:sz w:val="18"/>
-              </w:rPr>
-              <w:t>Moyen</w:t>
-            </w:r>
-          </w:p>
-        </w:tc>
-        <w:tc>
-          <w:tcPr>
-            <w:tcW w:w="1440" w:type="dxa"/>
-          </w:tcPr>
-          <w:p>
-            <w:r>
-              <w:rPr>
-                <w:sz w:val="18"/>
-              </w:rPr>
-              <w:t>Rétention 30 jours du brut, agrégation progressive, purge automatisée</w:t>
-            </w:r>
-          </w:p>
-        </w:tc>
-        <w:tc>
-          <w:tcPr>
-            <w:tcW w:w="1440" w:type="dxa"/>
-          </w:tcPr>
-          <w:p>
-            <w:r>
-              <w:rPr>
-                <w:sz w:val="18"/>
-              </w:rPr>
+              <w:lastRenderedPageBreak/>
               <w:t>Équipe data</w:t>
             </w:r>
           </w:p>
@@ -3345,11 +3401,7 @@
         <w:pStyle w:val="Listepuces"/>
       </w:pPr>
       <w:r>
-        <w:t xml:space="preserve">Pour le lot 2 : pseudonymisation des réclamations dès l'ingestion, clé de correspondance conservée séparément sous la responsabilité du DPO, analyse d'impact (AIPD) si l'analyse préalable la juge nécessaire. La veille rappelle que des données </w:t>
-      </w:r>
-      <w:r>
-        <w:lastRenderedPageBreak/>
-        <w:t>pseudonymisées restent des données personnelles ; seule une agrégation anonymisante les sort du champ RGPD.</w:t>
+        <w:t>Pour le lot 2 : pseudonymisation des réclamations dès l'ingestion, clé de correspondance conservée séparément sous la responsabilité du DPO, analyse d'impact (AIPD) si l'analyse préalable la juge nécessaire. La veille rappelle que des données pseudonymisées restent des données personnelles ; seule une agrégation anonymisante les sort du champ RGPD.</w:t>
       </w:r>
     </w:p>
     <w:p>
@@ -3374,6 +3426,7 @@
         <w:pStyle w:val="Titre2"/>
       </w:pPr>
       <w:r>
+        <w:lastRenderedPageBreak/>
         <w:t>RGAA : décisions prises</w:t>
       </w:r>
     </w:p>
@@ -3533,7 +3586,6 @@
         <w:pStyle w:val="Titre1"/>
       </w:pPr>
       <w:r>
-        <w:lastRenderedPageBreak/>
         <w:t>3.8 Cycle de vie des ressources numériques</w:t>
       </w:r>
     </w:p>
@@ -3637,7 +3689,14 @@
               <w:rPr>
                 <w:sz w:val="18"/>
               </w:rPr>
-              <w:t>Événements bruts capteurs et SAE</w:t>
+              <w:t xml:space="preserve">Événements bruts </w:t>
+            </w:r>
+            <w:r>
+              <w:rPr>
+                <w:sz w:val="18"/>
+              </w:rPr>
+              <w:lastRenderedPageBreak/>
+              <w:t>capteurs et SAE</w:t>
             </w:r>
           </w:p>
         </w:tc>
@@ -3650,6 +3709,7 @@
               <w:rPr>
                 <w:sz w:val="18"/>
               </w:rPr>
+              <w:lastRenderedPageBreak/>
               <w:t>Ingestion continue</w:t>
             </w:r>
           </w:p>
@@ -3663,7 +3723,14 @@
               <w:rPr>
                 <w:sz w:val="18"/>
               </w:rPr>
-              <w:t>30 jours (contrôles qualité, rejeu en cas d'incident)</w:t>
+              <w:t xml:space="preserve">30 jours (contrôles </w:t>
+            </w:r>
+            <w:r>
+              <w:rPr>
+                <w:sz w:val="18"/>
+              </w:rPr>
+              <w:lastRenderedPageBreak/>
+              <w:t>qualité, rejeu en cas d'incident)</w:t>
             </w:r>
           </w:p>
         </w:tc>
@@ -3676,7 +3743,15 @@
               <w:rPr>
                 <w:sz w:val="18"/>
               </w:rPr>
-              <w:t>Aucun (agrégats produits avant purge)</w:t>
+              <w:lastRenderedPageBreak/>
+              <w:t xml:space="preserve">Aucun (agrégats </w:t>
+            </w:r>
+            <w:r>
+              <w:rPr>
+                <w:sz w:val="18"/>
+              </w:rPr>
+              <w:lastRenderedPageBreak/>
+              <w:t>produits avant purge)</w:t>
             </w:r>
           </w:p>
         </w:tc>
@@ -3689,7 +3764,15 @@
               <w:rPr>
                 <w:sz w:val="18"/>
               </w:rPr>
-              <w:t>Purge automatique à 30 jours</w:t>
+              <w:lastRenderedPageBreak/>
+              <w:t xml:space="preserve">Purge automatique </w:t>
+            </w:r>
+            <w:r>
+              <w:rPr>
+                <w:sz w:val="18"/>
+              </w:rPr>
+              <w:lastRenderedPageBreak/>
+              <w:t>à 30 jours</w:t>
             </w:r>
           </w:p>
         </w:tc>
@@ -3704,6 +3787,7 @@
               <w:rPr>
                 <w:sz w:val="18"/>
               </w:rPr>
+              <w:lastRenderedPageBreak/>
               <w:t>Agrégats horaires</w:t>
             </w:r>
           </w:p>
@@ -4620,7 +4704,6 @@
                 <w:b/>
                 <w:sz w:val="18"/>
               </w:rPr>
-              <w:lastRenderedPageBreak/>
               <w:t>Indicateur</w:t>
             </w:r>
           </w:p>
@@ -4762,6 +4845,7 @@
               <w:rPr>
                 <w:sz w:val="18"/>
               </w:rPr>
+              <w:lastRenderedPageBreak/>
               <w:t>Budget</w:t>
             </w:r>
           </w:p>

</xml_diff>